<commit_message>
Add Rule Agents & README
</commit_message>
<xml_diff>
--- a/Docs/MinecraftBuilder_Requirements_VI.docx
+++ b/Docs/MinecraftBuilder_Requirements_VI.docx
@@ -37,12 +37,7 @@
         <w:jc w:val="center"/>
       </w:pPr>
       <w:r>
-        <w:rPr>
-          <w:rFonts w:ascii="Noto Sans" w:hAnsi="Noto Sans"/>
-          <w:color w:val="5B6573"/>
-          <w:sz w:val="21"/>
-        </w:rPr>
-        <w:t>Phiên bản 0.1  •  MVP local-first  •  Minecraft Java 1.21.1</w:t>
+        <w:t>Phiên bản 0.2  •  MVP local-first  •  Minecraft Java 1.21.1</w:t>
       </w:r>
     </w:p>
     <w:p/>
@@ -4141,7 +4136,7 @@
         <w:keepNext/>
       </w:pPr>
       <w:r>
-        <w:t>13. Công nghệ MVP</w:t>
+        <w:t>13. Công nghệ sử dụng</w:t>
       </w:r>
     </w:p>
     <w:tbl>
@@ -4172,12 +4167,6 @@
           </w:tcPr>
           <w:p>
             <w:r>
-              <w:rPr>
-                <w:rFonts w:ascii="Noto Sans" w:hAnsi="Noto Sans"/>
-                <w:b/>
-                <w:color w:val="FFFFFF"/>
-                <w:sz w:val="18"/>
-              </w:rPr>
               <w:t>Phần</w:t>
             </w:r>
           </w:p>
@@ -4198,13 +4187,7 @@
           </w:tcPr>
           <w:p>
             <w:r>
-              <w:rPr>
-                <w:rFonts w:ascii="Noto Sans" w:hAnsi="Noto Sans"/>
-                <w:b/>
-                <w:color w:val="FFFFFF"/>
-                <w:sz w:val="18"/>
-              </w:rPr>
-              <w:t>Công nghệ ưu tiên</w:t>
+              <w:t>Công nghệ / định hướng</w:t>
             </w:r>
           </w:p>
         </w:tc>
@@ -4225,14 +4208,7 @@
             <w:vAlign w:val="center"/>
           </w:tcPr>
           <w:p>
-            <w:pPr>
-              <w:spacing w:after="0"/>
-            </w:pPr>
             <w:r>
-              <w:rPr>
-                <w:rFonts w:ascii="Noto Sans" w:hAnsi="Noto Sans"/>
-                <w:sz w:val="17"/>
-              </w:rPr>
               <w:t>Frontend</w:t>
             </w:r>
           </w:p>
@@ -4252,15 +4228,8 @@
             <w:vAlign w:val="center"/>
           </w:tcPr>
           <w:p>
-            <w:pPr>
-              <w:spacing w:after="0"/>
-            </w:pPr>
             <w:r>
-              <w:rPr>
-                <w:rFonts w:ascii="Noto Sans" w:hAnsi="Noto Sans"/>
-                <w:sz w:val="17"/>
-              </w:rPr>
-              <w:t>Angular + TypeScript</w:t>
+              <w:t>Angular 22 + TypeScript + SCSS</w:t>
             </w:r>
           </w:p>
         </w:tc>
@@ -4281,14 +4250,7 @@
             <w:vAlign w:val="center"/>
           </w:tcPr>
           <w:p>
-            <w:pPr>
-              <w:spacing w:after="0"/>
-            </w:pPr>
             <w:r>
-              <w:rPr>
-                <w:rFonts w:ascii="Noto Sans" w:hAnsi="Noto Sans"/>
-                <w:sz w:val="17"/>
-              </w:rPr>
               <w:t>3D</w:t>
             </w:r>
           </w:p>
@@ -4308,14 +4270,7 @@
             <w:vAlign w:val="center"/>
           </w:tcPr>
           <w:p>
-            <w:pPr>
-              <w:spacing w:after="0"/>
-            </w:pPr>
             <w:r>
-              <w:rPr>
-                <w:rFonts w:ascii="Noto Sans" w:hAnsi="Noto Sans"/>
-                <w:sz w:val="17"/>
-              </w:rPr>
               <w:t>Three.js</w:t>
             </w:r>
           </w:p>
@@ -4337,14 +4292,7 @@
             <w:vAlign w:val="center"/>
           </w:tcPr>
           <w:p>
-            <w:pPr>
-              <w:spacing w:after="0"/>
-            </w:pPr>
             <w:r>
-              <w:rPr>
-                <w:rFonts w:ascii="Noto Sans" w:hAnsi="Noto Sans"/>
-                <w:sz w:val="17"/>
-              </w:rPr>
               <w:t>State/UI</w:t>
             </w:r>
           </w:p>
@@ -4364,14 +4312,7 @@
             <w:vAlign w:val="center"/>
           </w:tcPr>
           <w:p>
-            <w:pPr>
-              <w:spacing w:after="0"/>
-            </w:pPr>
             <w:r>
-              <w:rPr>
-                <w:rFonts w:ascii="Noto Sans" w:hAnsi="Noto Sans"/>
-                <w:sz w:val="17"/>
-              </w:rPr>
               <w:t>Angular Signals + RxJS</w:t>
             </w:r>
           </w:p>
@@ -4393,15 +4334,8 @@
             <w:vAlign w:val="center"/>
           </w:tcPr>
           <w:p>
-            <w:pPr>
-              <w:spacing w:after="0"/>
-            </w:pPr>
             <w:r>
-              <w:rPr>
-                <w:rFonts w:ascii="Noto Sans" w:hAnsi="Noto Sans"/>
-                <w:sz w:val="17"/>
-              </w:rPr>
-              <w:t>Local metadata</w:t>
+              <w:t>Lưu trữ local</w:t>
             </w:r>
           </w:p>
         </w:tc>
@@ -4420,15 +4354,8 @@
             <w:vAlign w:val="center"/>
           </w:tcPr>
           <w:p>
-            <w:pPr>
-              <w:spacing w:after="0"/>
-            </w:pPr>
             <w:r>
-              <w:rPr>
-                <w:rFonts w:ascii="Noto Sans" w:hAnsi="Noto Sans"/>
-                <w:sz w:val="17"/>
-              </w:rPr>
-              <w:t>IndexedDB; có thể dùng Dexie</w:t>
+              <w:t>IndexedDB của trình duyệt</w:t>
             </w:r>
           </w:p>
         </w:tc>
@@ -4449,15 +4376,8 @@
             <w:vAlign w:val="center"/>
           </w:tcPr>
           <w:p>
-            <w:pPr>
-              <w:spacing w:after="0"/>
-            </w:pPr>
             <w:r>
-              <w:rPr>
-                <w:rFonts w:ascii="Noto Sans" w:hAnsi="Noto Sans"/>
-                <w:sz w:val="17"/>
-              </w:rPr>
-              <w:t>File/assets lớn</w:t>
+              <w:t>Đọc JAR/ZIP</w:t>
             </w:r>
           </w:p>
         </w:tc>
@@ -4476,15 +4396,8 @@
             <w:vAlign w:val="center"/>
           </w:tcPr>
           <w:p>
-            <w:pPr>
-              <w:spacing w:after="0"/>
-            </w:pPr>
             <w:r>
-              <w:rPr>
-                <w:rFonts w:ascii="Noto Sans" w:hAnsi="Noto Sans"/>
-                <w:sz w:val="17"/>
-              </w:rPr>
-              <w:t>OPFS khi phù hợp</w:t>
+              <w:t>Thư viện ZIP chạy trên browser; package cụ thể được chọn khi triển khai</w:t>
             </w:r>
           </w:p>
         </w:tc>
@@ -4505,15 +4418,8 @@
             <w:vAlign w:val="center"/>
           </w:tcPr>
           <w:p>
-            <w:pPr>
-              <w:spacing w:after="0"/>
-            </w:pPr>
             <w:r>
-              <w:rPr>
-                <w:rFonts w:ascii="Noto Sans" w:hAnsi="Noto Sans"/>
-                <w:sz w:val="17"/>
-              </w:rPr>
-              <w:t>Đọc JAR/ZIP</w:t>
+              <w:t>NBT</w:t>
             </w:r>
           </w:p>
         </w:tc>
@@ -4532,15 +4438,8 @@
             <w:vAlign w:val="center"/>
           </w:tcPr>
           <w:p>
-            <w:pPr>
-              <w:spacing w:after="0"/>
-            </w:pPr>
             <w:r>
-              <w:rPr>
-                <w:rFonts w:ascii="Noto Sans" w:hAnsi="Noto Sans"/>
-                <w:sz w:val="17"/>
-              </w:rPr>
-              <w:t>fflate hoặc thư viện tương đương</w:t>
+              <w:t>Thư viện NBT tương thích browser, đặt sau abstraction để có thể thay implementation</w:t>
             </w:r>
           </w:p>
         </w:tc>
@@ -4561,15 +4460,8 @@
             <w:vAlign w:val="center"/>
           </w:tcPr>
           <w:p>
-            <w:pPr>
-              <w:spacing w:after="0"/>
-            </w:pPr>
             <w:r>
-              <w:rPr>
-                <w:rFonts w:ascii="Noto Sans" w:hAnsi="Noto Sans"/>
-                <w:sz w:val="17"/>
-              </w:rPr>
-              <w:t>NBT</w:t>
+              <w:t>Validate JSON</w:t>
             </w:r>
           </w:p>
         </w:tc>
@@ -4588,15 +4480,8 @@
             <w:vAlign w:val="center"/>
           </w:tcPr>
           <w:p>
-            <w:pPr>
-              <w:spacing w:after="0"/>
-            </w:pPr>
             <w:r>
-              <w:rPr>
-                <w:rFonts w:ascii="Noto Sans" w:hAnsi="Noto Sans"/>
-                <w:sz w:val="17"/>
-              </w:rPr>
-              <w:t>prismarine-nbt hoặc implementation được abstraction</w:t>
+              <w:t>JSON Schema hoặc runtime validator phù hợp; package cụ thể được chọn khi triển khai</w:t>
             </w:r>
           </w:p>
         </w:tc>
@@ -4617,15 +4502,8 @@
             <w:vAlign w:val="center"/>
           </w:tcPr>
           <w:p>
-            <w:pPr>
-              <w:spacing w:after="0"/>
-            </w:pPr>
             <w:r>
-              <w:rPr>
-                <w:rFonts w:ascii="Noto Sans" w:hAnsi="Noto Sans"/>
-                <w:sz w:val="17"/>
-              </w:rPr>
-              <w:t>Validate JSON</w:t>
+              <w:t>Môi trường phát triển frontend</w:t>
             </w:r>
           </w:p>
         </w:tc>
@@ -4644,15 +4522,8 @@
             <w:vAlign w:val="center"/>
           </w:tcPr>
           <w:p>
-            <w:pPr>
-              <w:spacing w:after="0"/>
-            </w:pPr>
             <w:r>
-              <w:rPr>
-                <w:rFonts w:ascii="Noto Sans" w:hAnsi="Noto Sans"/>
-                <w:sz w:val="17"/>
-              </w:rPr>
-              <w:t>Zod hoặc JSON Schema</w:t>
+              <w:t>Node.js 24 + npm</w:t>
             </w:r>
           </w:p>
         </w:tc>
@@ -5225,12 +5096,6 @@
           </w:tcPr>
           <w:p>
             <w:r>
-              <w:rPr>
-                <w:rFonts w:ascii="Noto Sans" w:hAnsi="Noto Sans"/>
-                <w:b/>
-                <w:color w:val="FFFFFF"/>
-                <w:sz w:val="18"/>
-              </w:rPr>
               <w:t>Thành phần</w:t>
             </w:r>
           </w:p>
@@ -5251,12 +5116,6 @@
           </w:tcPr>
           <w:p>
             <w:r>
-              <w:rPr>
-                <w:rFonts w:ascii="Noto Sans" w:hAnsi="Noto Sans"/>
-                <w:b/>
-                <w:color w:val="FFFFFF"/>
-                <w:sz w:val="18"/>
-              </w:rPr>
               <w:t>Định hướng</w:t>
             </w:r>
           </w:p>
@@ -5278,14 +5137,7 @@
             <w:vAlign w:val="center"/>
           </w:tcPr>
           <w:p>
-            <w:pPr>
-              <w:spacing w:after="0"/>
-            </w:pPr>
             <w:r>
-              <w:rPr>
-                <w:rFonts w:ascii="Noto Sans" w:hAnsi="Noto Sans"/>
-                <w:sz w:val="17"/>
-              </w:rPr>
               <w:t>Frontend</w:t>
             </w:r>
           </w:p>
@@ -5305,15 +5157,8 @@
             <w:vAlign w:val="center"/>
           </w:tcPr>
           <w:p>
-            <w:pPr>
-              <w:spacing w:after="0"/>
-            </w:pPr>
             <w:r>
-              <w:rPr>
-                <w:rFonts w:ascii="Noto Sans" w:hAnsi="Noto Sans"/>
-                <w:sz w:val="17"/>
-              </w:rPr>
-              <w:t>Tiếp tục Angular + TypeScript</w:t>
+              <w:t>Angular 22 + TypeScript + SCSS + Three.js</w:t>
             </w:r>
           </w:p>
         </w:tc>
@@ -5334,14 +5179,7 @@
             <w:vAlign w:val="center"/>
           </w:tcPr>
           <w:p>
-            <w:pPr>
-              <w:spacing w:after="0"/>
-            </w:pPr>
             <w:r>
-              <w:rPr>
-                <w:rFonts w:ascii="Noto Sans" w:hAnsi="Noto Sans"/>
-                <w:sz w:val="17"/>
-              </w:rPr>
               <w:t>Backend</w:t>
             </w:r>
           </w:p>
@@ -5361,15 +5199,8 @@
             <w:vAlign w:val="center"/>
           </w:tcPr>
           <w:p>
-            <w:pPr>
-              <w:spacing w:after="0"/>
-            </w:pPr>
             <w:r>
-              <w:rPr>
-                <w:rFonts w:ascii="Noto Sans" w:hAnsi="Noto Sans"/>
-                <w:sz w:val="17"/>
-              </w:rPr>
-              <w:t>Node.js + TypeScript; Fastify hoặc framework tương đương</w:t>
+              <w:t>ASP.NET Core Web API + C# trên .NET 10 LTS</w:t>
             </w:r>
           </w:p>
         </w:tc>
@@ -5390,15 +5221,8 @@
             <w:vAlign w:val="center"/>
           </w:tcPr>
           <w:p>
-            <w:pPr>
-              <w:spacing w:after="0"/>
-            </w:pPr>
             <w:r>
-              <w:rPr>
-                <w:rFonts w:ascii="Noto Sans" w:hAnsi="Noto Sans"/>
-                <w:sz w:val="17"/>
-              </w:rPr>
-              <w:t>Database chính</w:t>
+              <w:t>Data access</w:t>
             </w:r>
           </w:p>
         </w:tc>
@@ -5417,15 +5241,8 @@
             <w:vAlign w:val="center"/>
           </w:tcPr>
           <w:p>
-            <w:pPr>
-              <w:spacing w:after="0"/>
-            </w:pPr>
             <w:r>
-              <w:rPr>
-                <w:rFonts w:ascii="Noto Sans" w:hAnsi="Noto Sans"/>
-                <w:sz w:val="17"/>
-              </w:rPr>
-              <w:t>PostgreSQL</w:t>
+              <w:t>Entity Framework Core 10</w:t>
             </w:r>
           </w:p>
         </w:tc>
@@ -5446,15 +5263,8 @@
             <w:vAlign w:val="center"/>
           </w:tcPr>
           <w:p>
-            <w:pPr>
-              <w:spacing w:after="0"/>
-            </w:pPr>
             <w:r>
-              <w:rPr>
-                <w:rFonts w:ascii="Noto Sans" w:hAnsi="Noto Sans"/>
-                <w:sz w:val="17"/>
-              </w:rPr>
-              <w:t>File/Object storage</w:t>
+              <w:t>Database chính</w:t>
             </w:r>
           </w:p>
         </w:tc>
@@ -5473,15 +5283,8 @@
             <w:vAlign w:val="center"/>
           </w:tcPr>
           <w:p>
-            <w:pPr>
-              <w:spacing w:after="0"/>
-            </w:pPr>
             <w:r>
-              <w:rPr>
-                <w:rFonts w:ascii="Noto Sans" w:hAnsi="Noto Sans"/>
-                <w:sz w:val="17"/>
-              </w:rPr>
-              <w:t>S3-compatible Object Storage</w:t>
+              <w:t>PostgreSQL</w:t>
             </w:r>
           </w:p>
         </w:tc>
@@ -5493,7 +5296,7 @@
         <w:spacing w:after="30"/>
       </w:pPr>
       <w:r>
-        <w:t>PostgreSQL lưu users, account, project metadata, ownership, plans, premium/subscription status, admin config, permissions và mod library metadata.</w:t>
+        <w:t>Backend sử dụng ASP.NET Core Web API trên .NET 10 LTS, Entity Framework Core 10 và PostgreSQL. PostgreSQL lưu users, account, project metadata, ownership, plans, premium/subscription status, admin config, permissions và mod library metadata.</w:t>
       </w:r>
     </w:p>
     <w:p>
@@ -5502,7 +5305,7 @@
         <w:spacing w:after="30"/>
       </w:pPr>
       <w:r>
-        <w:t>Structure binary, project package, thumbnail và asset lớn lưu ở object storage thay vì nhét trực tiếp vào SQL.</w:t>
+        <w:t>Structure binary, project package, thumbnail và asset lớn không nên lưu trực tiếp trong PostgreSQL; sử dụng object/file storage khi triển khai cloud storage.</w:t>
       </w:r>
     </w:p>
     <w:p>

</xml_diff>